<commit_message>
Restructured for ease of use
</commit_message>
<xml_diff>
--- a/Interviews/Consent Forms/Consent Form - Participant 1.docx
+++ b/Interviews/Consent Forms/Consent Form - Participant 1.docx
@@ -683,6 +683,72 @@
           <w:lang w:val="en-US"/>
         </w:rPr>
         <mc:AlternateContent>
+          <mc:Choice Requires="wpi">
+            <w:drawing>
+              <wp:anchor distT="0" distB="0" distL="114300" distR="114300" simplePos="0" relativeHeight="251666432" behindDoc="0" locked="0" layoutInCell="1" allowOverlap="1" wp14:anchorId="73C247C1" wp14:editId="0AFD69C0">
+                <wp:simplePos x="0" y="0"/>
+                <wp:positionH relativeFrom="column">
+                  <wp:posOffset>6010910</wp:posOffset>
+                </wp:positionH>
+                <wp:positionV relativeFrom="paragraph">
+                  <wp:posOffset>-577850</wp:posOffset>
+                </wp:positionV>
+                <wp:extent cx="421620" cy="1413310"/>
+                <wp:effectExtent l="38100" t="38100" r="36195" b="34925"/>
+                <wp:wrapNone/>
+                <wp:docPr id="204464718" name="Ink 8"/>
+                <wp:cNvGraphicFramePr/>
+                <a:graphic xmlns:a="http://schemas.openxmlformats.org/drawingml/2006/main">
+                  <a:graphicData uri="http://schemas.microsoft.com/office/word/2010/wordprocessingInk">
+                    <w14:contentPart bwMode="auto" r:id="rId5">
+                      <w14:nvContentPartPr>
+                        <w14:cNvContentPartPr/>
+                      </w14:nvContentPartPr>
+                      <w14:xfrm>
+                        <a:off x="0" y="0"/>
+                        <a:ext cx="421620" cy="1413310"/>
+                      </w14:xfrm>
+                    </w14:contentPart>
+                  </a:graphicData>
+                </a:graphic>
+              </wp:anchor>
+            </w:drawing>
+          </mc:Choice>
+          <mc:Fallback>
+            <w:pict>
+              <v:shapetype w14:anchorId="19A07465" id="_x0000_t75" coordsize="21600,21600" o:spt="75" o:preferrelative="t" path="m@4@5l@4@11@9@11@9@5xe" filled="f" stroked="f">
+                <v:stroke joinstyle="miter"/>
+                <v:formulas>
+                  <v:f eqn="if lineDrawn pixelLineWidth 0"/>
+                  <v:f eqn="sum @0 1 0"/>
+                  <v:f eqn="sum 0 0 @1"/>
+                  <v:f eqn="prod @2 1 2"/>
+                  <v:f eqn="prod @3 21600 pixelWidth"/>
+                  <v:f eqn="prod @3 21600 pixelHeight"/>
+                  <v:f eqn="sum @0 0 1"/>
+                  <v:f eqn="prod @6 1 2"/>
+                  <v:f eqn="prod @7 21600 pixelWidth"/>
+                  <v:f eqn="sum @8 21600 0"/>
+                  <v:f eqn="prod @7 21600 pixelHeight"/>
+                  <v:f eqn="sum @10 21600 0"/>
+                </v:formulas>
+                <v:path o:extrusionok="f" gradientshapeok="t" o:connecttype="rect"/>
+                <o:lock v:ext="edit" aspectratio="t"/>
+              </v:shapetype>
+              <v:shape id="Ink 8" o:spid="_x0000_s1026" type="#_x0000_t75" style="position:absolute;margin-left:472.8pt;margin-top:-46pt;width:34.2pt;height:112.3pt;z-index:251666432;visibility:visible;mso-wrap-style:square;mso-wrap-distance-left:9pt;mso-wrap-distance-top:0;mso-wrap-distance-right:9pt;mso-wrap-distance-bottom:0;mso-position-horizontal:absolute;mso-position-horizontal-relative:text;mso-position-vertical:absolute;mso-position-vertical-relative:text" o:gfxdata="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">
+                <v:imagedata r:id="rId6" o:title=""/>
+              </v:shape>
+            </w:pict>
+          </mc:Fallback>
+        </mc:AlternateContent>
+      </w:r>
+      <w:r>
+        <w:rPr>
+          <w:noProof/>
+          <w:color w:val="000000" w:themeColor="text1"/>
+          <w:lang w:val="en-US"/>
+        </w:rPr>
+        <mc:AlternateContent>
           <mc:Choice Requires="wps">
             <w:drawing>
               <wp:anchor distT="0" distB="0" distL="114300" distR="114300" simplePos="0" relativeHeight="251659264" behindDoc="0" locked="0" layoutInCell="1" allowOverlap="1" wp14:anchorId="544D0369" wp14:editId="2988B30E">
@@ -955,10 +1021,50 @@
         <w:rPr>
           <w:rFonts w:ascii="Arial" w:hAnsi="Arial" w:cs="Arial"/>
           <w:b/>
-          <w:sz w:val="20"/>
-          <w:szCs w:val="20"/>
-        </w:rPr>
-        <w:t>Name of Participant:</w:t>
+          <w:noProof/>
+          <w:sz w:val="20"/>
+          <w:szCs w:val="20"/>
+        </w:rPr>
+        <mc:AlternateContent>
+          <mc:Choice Requires="wpi">
+            <w:drawing>
+              <wp:anchor distT="0" distB="0" distL="114300" distR="114300" simplePos="0" relativeHeight="251667456" behindDoc="0" locked="0" layoutInCell="1" allowOverlap="1" wp14:anchorId="1190B5A1" wp14:editId="5A8BB77C">
+                <wp:simplePos x="0" y="0"/>
+                <wp:positionH relativeFrom="column">
+                  <wp:posOffset>1459999</wp:posOffset>
+                </wp:positionH>
+                <wp:positionV relativeFrom="paragraph">
+                  <wp:posOffset>123414</wp:posOffset>
+                </wp:positionV>
+                <wp:extent cx="360" cy="1440"/>
+                <wp:effectExtent l="38100" t="38100" r="38100" b="36830"/>
+                <wp:wrapNone/>
+                <wp:docPr id="1329690667" name="Ink 9"/>
+                <wp:cNvGraphicFramePr/>
+                <a:graphic xmlns:a="http://schemas.openxmlformats.org/drawingml/2006/main">
+                  <a:graphicData uri="http://schemas.microsoft.com/office/word/2010/wordprocessingInk">
+                    <w14:contentPart bwMode="auto" r:id="rId7">
+                      <w14:nvContentPartPr>
+                        <w14:cNvContentPartPr/>
+                      </w14:nvContentPartPr>
+                      <w14:xfrm>
+                        <a:off x="0" y="0"/>
+                        <a:ext cx="360" cy="1440"/>
+                      </w14:xfrm>
+                    </w14:contentPart>
+                  </a:graphicData>
+                </a:graphic>
+              </wp:anchor>
+            </w:drawing>
+          </mc:Choice>
+          <mc:Fallback>
+            <w:pict>
+              <v:shape w14:anchorId="75BC1CD5" id="Ink 9" o:spid="_x0000_s1026" type="#_x0000_t75" style="position:absolute;margin-left:114.45pt;margin-top:9.2pt;width:1.05pt;height:1.1pt;z-index:251667456;visibility:visible;mso-wrap-style:square;mso-wrap-distance-left:9pt;mso-wrap-distance-top:0;mso-wrap-distance-right:9pt;mso-wrap-distance-bottom:0;mso-position-horizontal:absolute;mso-position-horizontal-relative:text;mso-position-vertical:absolute;mso-position-vertical-relative:text" o:gfxdata="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">
+                <v:imagedata r:id="rId8" o:title=""/>
+              </v:shape>
+            </w:pict>
+          </mc:Fallback>
+        </mc:AlternateContent>
       </w:r>
       <w:r>
         <w:rPr>
@@ -967,7 +1073,7 @@
           <w:sz w:val="20"/>
           <w:szCs w:val="20"/>
         </w:rPr>
-        <w:tab/>
+        <w:t>Name of Participant:</w:t>
       </w:r>
       <w:r>
         <w:rPr>
@@ -976,7 +1082,7 @@
           <w:sz w:val="20"/>
           <w:szCs w:val="20"/>
         </w:rPr>
-        <w:tab/>
+        <w:t xml:space="preserve"> Henry Pealin</w:t>
       </w:r>
       <w:r>
         <w:rPr>
@@ -995,6 +1101,7 @@
           <w:szCs w:val="20"/>
         </w:rPr>
         <w:tab/>
+        <w:t>Date:</w:t>
       </w:r>
       <w:r>
         <w:rPr>
@@ -1003,8 +1110,7 @@
           <w:sz w:val="20"/>
           <w:szCs w:val="20"/>
         </w:rPr>
-        <w:tab/>
-        <w:t>Date:</w:t>
+        <w:t xml:space="preserve"> 07/11/2025</w:t>
       </w:r>
       <w:r>
         <w:rPr>
@@ -1828,6 +1934,62 @@
 </w:styles>
 </file>
 
+<file path=word/ink/ink1.xml><?xml version="1.0" encoding="utf-8"?>
+<inkml:ink xmlns:inkml="http://www.w3.org/2003/InkML">
+  <inkml:definitions>
+    <inkml:context xml:id="ctx0">
+      <inkml:inkSource xml:id="inkSrc0">
+        <inkml:traceFormat>
+          <inkml:channel name="X" type="integer" min="-2.14748E9" max="2.14748E9" units="cm"/>
+          <inkml:channel name="Y" type="integer" min="-2.14748E9" max="2.14748E9" units="cm"/>
+          <inkml:channel name="F" type="integer" max="32767" units="dev"/>
+        </inkml:traceFormat>
+        <inkml:channelProperties>
+          <inkml:channelProperty channel="X" name="resolution" value="1000" units="1/cm"/>
+          <inkml:channelProperty channel="Y" name="resolution" value="1000" units="1/cm"/>
+          <inkml:channelProperty channel="F" name="resolution" value="0" units="1/dev"/>
+        </inkml:channelProperties>
+      </inkml:inkSource>
+      <inkml:timestamp xml:id="ts0" timeString="2025-11-11T10:32:19.344"/>
+    </inkml:context>
+    <inkml:brush xml:id="br0">
+      <inkml:brushProperty name="width" value="0.035" units="cm"/>
+      <inkml:brushProperty name="height" value="0.035" units="cm"/>
+    </inkml:brush>
+  </inkml:definitions>
+  <inkml:trace contextRef="#ctx0" brushRef="#br0">1 854 24575,'23'27'0,"-11"-15"0,-4 0 0,0 0 0,-1 1 0,0 0 0,6 19 0,15 28 0,21 42 0,-48-101 0,-1 1 0,1-1 0,0 1 0,0-1 0,0 0 0,0 1 0,0-1 0,0 0 0,0 1 0,0-1 0,0 0 0,0 0 0,1 0 0,-1 0 0,1 0 0,-1-1 0,0 1 0,3 1 0,-4-3 0,1 1 0,0 0 0,-1-1 0,1 1 0,0-1 0,-1 1 0,1-1 0,-1 1 0,1-1 0,-1 1 0,1-1 0,-1 1 0,1-1 0,-1 0 0,0 1 0,1-1 0,-1 0 0,0 1 0,1-1 0,-1 0 0,0 0 0,0 1 0,0-1 0,0 0 0,0 0 0,0 0 0,3-69 0,-3 63 0,0-6 0,1-1 0,1 1 0,0 0 0,1 0 0,0 0 0,8-18 0,37-74 0,-35 77 0,151-267 0,-157 285 0,44-79 0,117-188 0,-144 240-64,-6 11-586,27-51-1,-41 65-6175</inkml:trace>
+  <inkml:trace contextRef="#ctx0" brushRef="#br0" timeOffset="2056.25">40 2105 24575,'5'4'0,"-1"0"0,1 0 0,-1 1 0,0-1 0,0 1 0,0 0 0,-1 0 0,5 9 0,-8-13 0,14 22 0,-1 0 0,-2 1 0,0 1 0,7 25 0,-14-29 0,-2-11 0,0-1 0,1 1 0,0-1 0,7 17 0,-9-24 0,0-1 0,0 1 0,0-1 0,0 1 0,0-1 0,0 0 0,0 1 0,0-1 0,0 0 0,1 0 0,-1 0 0,1 0 0,-1 0 0,0 0 0,1 0 0,0-1 0,-1 1 0,1 0 0,-1-1 0,1 1 0,0-1 0,0 0 0,-1 1 0,1-1 0,0 0 0,-1 0 0,1 0 0,0 0 0,0-1 0,-1 1 0,1 0 0,0-1 0,2-1 0,-2 2 0,0-1 0,-1 0 0,1 0 0,-1 0 0,1-1 0,-1 1 0,0 0 0,1-1 0,-1 1 0,0 0 0,0-1 0,0 0 0,0 1 0,0-1 0,0 0 0,0 1 0,-1-1 0,2-2 0,9-41 0,-2 6 0,35-88 0,-34 105 0,34-78 0,66-107 0,-93 179 0,2 0 0,0 1 0,39-41 0,30-27 0,-9-5 0,-72 92 0,1-2 0,-1 1 0,-1-1 0,8-14 0,-8 13 0,0 1 0,1-1 0,0 1 0,10-10 0,1 1-1365,-11 10-5461</inkml:trace>
+  <inkml:trace contextRef="#ctx0" brushRef="#br0" timeOffset="3783.83">21 3526 24575,'2'8'0,"-1"-1"0,1 0 0,1 1 0,-1-1 0,1 0 0,0 0 0,1-1 0,0 1 0,0-1 0,6 8 0,16 29 0,7 18 0,-25-49 0,0 1 0,-1 0 0,-1 0 0,0 0 0,-1 1 0,7 27 0,-12-33 0,1 0 0,1-1 0,-1 1 0,1-1 0,1 0 0,-1 0 0,1 0 0,0 0 0,1 0 0,8 12 0,-10-22 0,1 0 0,-1 0 0,0 0 0,0 0 0,0 0 0,-1-1 0,1 1 0,-1 0 0,0-1 0,1-5 0,3-6 0,1 0 0,0 0 0,1 1 0,0 0 0,14-20 0,15-27 0,9-21 0,89-122 0,-68 112 0,159-234 0,-21 43 0,-196 272 0,45-69 0,-37 53 0,36-44 0,-2 0-1365,-44 61-5461</inkml:trace>
+</inkml:ink>
+</file>
+
+<file path=word/ink/ink2.xml><?xml version="1.0" encoding="utf-8"?>
+<inkml:ink xmlns:inkml="http://www.w3.org/2003/InkML">
+  <inkml:definitions>
+    <inkml:context xml:id="ctx0">
+      <inkml:inkSource xml:id="inkSrc0">
+        <inkml:traceFormat>
+          <inkml:channel name="X" type="integer" min="-2.14748E9" max="2.14748E9" units="cm"/>
+          <inkml:channel name="Y" type="integer" min="-2.14748E9" max="2.14748E9" units="cm"/>
+          <inkml:channel name="F" type="integer" max="32767" units="dev"/>
+        </inkml:traceFormat>
+        <inkml:channelProperties>
+          <inkml:channelProperty channel="X" name="resolution" value="1000" units="1/cm"/>
+          <inkml:channelProperty channel="Y" name="resolution" value="1000" units="1/cm"/>
+          <inkml:channelProperty channel="F" name="resolution" value="0" units="1/dev"/>
+        </inkml:channelProperties>
+      </inkml:inkSource>
+      <inkml:timestamp xml:id="ts0" timeString="2025-11-11T10:32:27.438"/>
+    </inkml:context>
+    <inkml:brush xml:id="br0">
+      <inkml:brushProperty name="width" value="0.035" units="cm"/>
+      <inkml:brushProperty name="height" value="0.035" units="cm"/>
+    </inkml:brush>
+  </inkml:definitions>
+  <inkml:trace contextRef="#ctx0" brushRef="#br0">0 0 24575,'0'4'0</inkml:trace>
+</inkml:ink>
+</file>
+
 <file path=word/theme/theme1.xml><?xml version="1.0" encoding="utf-8"?>
 <a:theme xmlns:a="http://schemas.openxmlformats.org/drawingml/2006/main" name="Office Theme">
   <a:themeElements>

</xml_diff>